<commit_message>
Add RC script updates.
</commit_message>
<xml_diff>
--- a/tables/mock_redcap_table1.docx
+++ b/tables/mock_redcap_table1.docx
@@ -698,7 +698,7 @@
                 <w:szCs w:val="22"/>
                 <w:color w:val="000000"/>
               </w:rPr>
-              <w:t xml:space="preserve">age_years</w:t>
+              <w:t xml:space="preserve">Age (years)</w:t>
             </w:r>
           </w:p>
         </w:tc>
@@ -978,7 +978,7 @@
                 <w:szCs w:val="22"/>
                 <w:color w:val="000000"/>
               </w:rPr>
-              <w:t xml:space="preserve">smoker</w:t>
+              <w:t xml:space="preserve">Smoker</w:t>
             </w:r>
           </w:p>
         </w:tc>
@@ -1258,7 +1258,7 @@
                 <w:szCs w:val="22"/>
                 <w:color w:val="000000"/>
               </w:rPr>
-              <w:t xml:space="preserve">diabetes_mellitus</w:t>
+              <w:t xml:space="preserve">Diabetes Mellitus</w:t>
             </w:r>
           </w:p>
         </w:tc>
@@ -1538,7 +1538,7 @@
                 <w:szCs w:val="22"/>
                 <w:color w:val="000000"/>
               </w:rPr>
-              <w:t xml:space="preserve">cad</w:t>
+              <w:t xml:space="preserve">CAD</w:t>
             </w:r>
           </w:p>
         </w:tc>
@@ -1818,7 +1818,7 @@
                 <w:szCs w:val="22"/>
                 <w:color w:val="000000"/>
               </w:rPr>
-              <w:t xml:space="preserve">copd</w:t>
+              <w:t xml:space="preserve">COPD</w:t>
             </w:r>
           </w:p>
         </w:tc>

</xml_diff>